<commit_message>
Update forms with 'preuve de paiement' instead of 'facture'
</commit_message>
<xml_diff>
--- a/templates/facture_template - empty.docx
+++ b/templates/facture_template - empty.docx
@@ -27,7 +27,7 @@
     </w:p>
     <w:p>
       <w:pPr>
-        <w:framePr w:w="2295" w:wrap="auto" w:vAnchor="page" w:hAnchor="page" w:x="9316" w:y="451"/>
+        <w:framePr w:w="4936" w:wrap="auto" w:vAnchor="page" w:hAnchor="page" w:x="6646" w:y="301"/>
         <w:widowControl w:val="0"/>
         <w:autoSpaceDE w:val="0"/>
         <w:autoSpaceDN w:val="0"/>
@@ -49,7 +49,7 @@
           <w:sz w:val="43"/>
           <w:lang w:val="fr-FR"/>
         </w:rPr>
-        <w:t>FACTURE</w:t>
+        <w:t>PREUVE DE PAIEMENT</w:t>
       </w:r>
     </w:p>
     <w:p>

</xml_diff>